<commit_message>
Update build.js and regenerate DOCX resume
</commit_message>
<xml_diff>
--- a/public/Klyde_Joseph_Yabo_Resume.docx
+++ b/public/Klyde_Joseph_Yabo_Resume.docx
@@ -20,22 +20,6 @@
     </w:p>
     <w:p>
       <w:pPr>
-        <w:spacing w:after="140"/>
-      </w:pPr>
-      <w:r>
-        <w:rPr>
-          <w:rFonts w:ascii="Calibri" w:cs="Calibri" w:eastAsia="Calibri" w:hAnsi="Calibri"/>
-          <w:b/>
-          <w:bCs/>
-          <w:color w:val="8B4513"/>
-          <w:sz w:val="21"/>
-          <w:szCs w:val="21"/>
-        </w:rPr>
-        <w:t xml:space="preserve">Software Automation Engineer  |  Python  |  JavaScript  |  Broadcast Automation</w:t>
-      </w:r>
-    </w:p>
-    <w:p>
-      <w:pPr>
         <w:pBdr>
           <w:bottom w:val="single" w:color="8B4513" w:sz="12" w:space="6"/>
         </w:pBdr>
@@ -50,7 +34,7 @@
         </w:rPr>
         <w:t xml:space="preserve">klydejosephy@gmail.com   |   +63 945 592 7782   |   </w:t>
       </w:r>
-      <w:hyperlink w:history="1" r:id="rIdmgw3ievb-d-_wnthsjchp">
+      <w:hyperlink w:history="1" r:id="rIdghpxqd4m5ksxb-thy6n3u">
         <w:r>
           <w:rPr>
             <w:rFonts w:ascii="Calibri" w:cs="Calibri" w:eastAsia="Calibri" w:hAnsi="Calibri"/>
@@ -71,7 +55,7 @@
         </w:rPr>
         <w:t xml:space="preserve">   |   </w:t>
       </w:r>
-      <w:hyperlink w:history="1" r:id="rIdfswb7uvm65kjbiuk-wyy4">
+      <w:hyperlink w:history="1" r:id="rIdwh0dy8wuprmk5wh7lldw2">
         <w:r>
           <w:rPr>
             <w:rFonts w:ascii="Calibri" w:cs="Calibri" w:eastAsia="Calibri" w:hAnsi="Calibri"/>
@@ -80,7 +64,7 @@
             <w:szCs w:val="18"/>
             <w:u w:val="single"/>
           </w:rPr>
-          <w:t xml:space="preserve">linkedin.com/in/klyde-joseph-yabo</w:t>
+          <w:t xml:space="preserve">yabopersonalportfolio.vercel.app</w:t>
         </w:r>
       </w:hyperlink>
       <w:r>
@@ -245,7 +229,7 @@
                 <w:sz w:val="20"/>
                 <w:szCs w:val="20"/>
               </w:rPr>
-              <w:t xml:space="preserve">	2022 – Present</w:t>
+              <w:t xml:space="preserve">	2025 – Present</w:t>
             </w:r>
           </w:p>
           <w:p>
@@ -400,7 +384,7 @@
                 <w:sz w:val="20"/>
                 <w:szCs w:val="20"/>
               </w:rPr>
-              <w:t xml:space="preserve">Created Drama Report Gen, an automated document engine that generates broadcast logs and performance reports, cutting manual data entry by approximately 90%.</w:t>
+              <w:t xml:space="preserve">Developed a Drama Report Generator using Raduga in VirtualBox, automating broadcast log and performance report generation and reducing manual data entry by approximately 90%, improving reporting efficiency and accuracy.</w:t>
             </w:r>
           </w:p>
           <w:p>
@@ -490,7 +474,7 @@
                 <w:sz w:val="20"/>
                 <w:szCs w:val="20"/>
               </w:rPr>
-              <w:t xml:space="preserve">Performed diagnostic troubleshooting, component upgrades, and repair services for 30+ PCs and office printers.</w:t>
+              <w:t xml:space="preserve">Performed diagnostic troubleshooting, component upgrades, and repair services.</w:t>
             </w:r>
           </w:p>
           <w:p>
@@ -509,7 +493,7 @@
                 <w:sz w:val="20"/>
                 <w:szCs w:val="20"/>
               </w:rPr>
-              <w:t xml:space="preserve">Installed operating systems, software packages, and system drivers, servicing 50+ local clients.</w:t>
+              <w:t xml:space="preserve">Installed operating systems, software packages, and system drivers.</w:t>
             </w:r>
           </w:p>
           <w:p>
@@ -675,7 +659,7 @@
                 <w:sz w:val="19"/>
                 <w:szCs w:val="19"/>
               </w:rPr>
-              <w:t xml:space="preserve">Git  •  GitHub  •  VS Code  •  OBS Studio  •  Linux</w:t>
+              <w:t xml:space="preserve">Git  •  GitHub  •  VS Code  •  OBS Studio</w:t>
             </w:r>
           </w:p>
           <w:p>
@@ -909,7 +893,7 @@
                 <w:sz w:val="20"/>
                 <w:szCs w:val="20"/>
               </w:rPr>
-              <w:t xml:space="preserve">Athlete of the Year 2024 – Bukidnon State University</w:t>
+              <w:t xml:space="preserve">College of Technologies Athlete of the Year 2024 – Bukidnon State University</w:t>
             </w:r>
           </w:p>
           <w:p>

</xml_diff>

<commit_message>
Update Resume: Change job title and add Tailwind CSS skill
</commit_message>
<xml_diff>
--- a/public/Klyde_Joseph_Yabo_Resume.docx
+++ b/public/Klyde_Joseph_Yabo_Resume.docx
@@ -34,7 +34,7 @@
         </w:rPr>
         <w:t xml:space="preserve">klydejosephy@gmail.com   |   +63 945 592 7782   |   </w:t>
       </w:r>
-      <w:hyperlink w:history="1" r:id="rIdghpxqd4m5ksxb-thy6n3u">
+      <w:hyperlink w:history="1" r:id="rIdyykjf5h2tsfj3fva1laz3">
         <w:r>
           <w:rPr>
             <w:rFonts w:ascii="Calibri" w:cs="Calibri" w:eastAsia="Calibri" w:hAnsi="Calibri"/>
@@ -55,7 +55,7 @@
         </w:rPr>
         <w:t xml:space="preserve">   |   </w:t>
       </w:r>
-      <w:hyperlink w:history="1" r:id="rIdwh0dy8wuprmk5wh7lldw2">
+      <w:hyperlink w:history="1" r:id="rIdhuajfgtge-cpegblrqq7w">
         <w:r>
           <w:rPr>
             <w:rFonts w:ascii="Calibri" w:cs="Calibri" w:eastAsia="Calibri" w:hAnsi="Calibri"/>
@@ -218,7 +218,7 @@
                 <w:sz w:val="22"/>
                 <w:szCs w:val="22"/>
               </w:rPr>
-              <w:t xml:space="preserve">Software Automation &amp; Systems Developer</w:t>
+              <w:t xml:space="preserve">Software Automation Developer</w:t>
             </w:r>
             <w:r>
               <w:rPr>
@@ -599,7 +599,7 @@
                 <w:sz w:val="19"/>
                 <w:szCs w:val="19"/>
               </w:rPr>
-              <w:t xml:space="preserve">React  •  HTML  •  CSS  •  Vite</w:t>
+              <w:t xml:space="preserve">React  •  HTML  •  CSS  •  Vite  •  Tailwind CSS</w:t>
             </w:r>
           </w:p>
           <w:p>

</xml_diff>

<commit_message>
Update project name Bombo News Intel to NewsPulse
</commit_message>
<xml_diff>
--- a/public/Klyde_Joseph_Yabo_Resume.docx
+++ b/public/Klyde_Joseph_Yabo_Resume.docx
@@ -34,7 +34,7 @@
         </w:rPr>
         <w:t xml:space="preserve">klydejosephy@gmail.com   |   +63 945 592 7782   |   </w:t>
       </w:r>
-      <w:hyperlink w:history="1" r:id="rIdyykjf5h2tsfj3fva1laz3">
+      <w:hyperlink w:history="1" r:id="rIdzbxaxzyy3fewowdjvtprb">
         <w:r>
           <w:rPr>
             <w:rFonts w:ascii="Calibri" w:cs="Calibri" w:eastAsia="Calibri" w:hAnsi="Calibri"/>
@@ -55,7 +55,7 @@
         </w:rPr>
         <w:t xml:space="preserve">   |   </w:t>
       </w:r>
-      <w:hyperlink w:history="1" r:id="rIdhuajfgtge-cpegblrqq7w">
+      <w:hyperlink w:history="1" r:id="rIdvxwi3tcmwvh7msitr8-8q">
         <w:r>
           <w:rPr>
             <w:rFonts w:ascii="Calibri" w:cs="Calibri" w:eastAsia="Calibri" w:hAnsi="Calibri"/>
@@ -289,7 +289,7 @@
                 <w:sz w:val="20"/>
                 <w:szCs w:val="20"/>
               </w:rPr>
-              <w:t xml:space="preserve">Built Bombo News Intel, an AI-powered news monitoring dashboard that aggregates 50+ live intelligence feeds, reducing manual news tracking time by approximately 80%.</w:t>
+              <w:t xml:space="preserve">Built NewsPulse, an AI-powered news monitoring dashboard that aggregates 50+ live intelligence feeds, reducing manual news tracking time by approximately 80%.</w:t>
             </w:r>
           </w:p>
           <w:p>

</xml_diff>

<commit_message>
Update portfolio projects and refine resume experience
</commit_message>
<xml_diff>
--- a/public/Klyde_Joseph_Yabo_Resume.docx
+++ b/public/Klyde_Joseph_Yabo_Resume.docx
@@ -34,7 +34,7 @@
         </w:rPr>
         <w:t xml:space="preserve">klydejosephy@gmail.com   |   +63 945 592 7782   |   </w:t>
       </w:r>
-      <w:hyperlink w:history="1" r:id="rIdzbxaxzyy3fewowdjvtprb">
+      <w:hyperlink w:history="1" r:id="rIdnbszuychpaseapvdx1_r7">
         <w:r>
           <w:rPr>
             <w:rFonts w:ascii="Calibri" w:cs="Calibri" w:eastAsia="Calibri" w:hAnsi="Calibri"/>
@@ -55,7 +55,7 @@
         </w:rPr>
         <w:t xml:space="preserve">   |   </w:t>
       </w:r>
-      <w:hyperlink w:history="1" r:id="rIdvxwi3tcmwvh7msitr8-8q">
+      <w:hyperlink w:history="1" r:id="rIdzhjfbljjtiell_fu6r-rz">
         <w:r>
           <w:rPr>
             <w:rFonts w:ascii="Calibri" w:cs="Calibri" w:eastAsia="Calibri" w:hAnsi="Calibri"/>
@@ -218,7 +218,7 @@
                 <w:sz w:val="22"/>
                 <w:szCs w:val="22"/>
               </w:rPr>
-              <w:t xml:space="preserve">Software Automation Developer</w:t>
+              <w:t xml:space="preserve">IT/Technician</w:t>
             </w:r>
             <w:r>
               <w:rPr>
@@ -289,7 +289,7 @@
                 <w:sz w:val="20"/>
                 <w:szCs w:val="20"/>
               </w:rPr>
-              <w:t xml:space="preserve">Built NewsPulse, an AI-powered news monitoring dashboard that aggregates 50+ live intelligence feeds, reducing manual news tracking time by approximately 80%.</w:t>
+              <w:t xml:space="preserve">Built news-headline-crawler, an automated news headline crawler that gathers the latest news from various sources to build a centralized real-time intelligence board.</w:t>
             </w:r>
           </w:p>
           <w:p>
@@ -308,7 +308,7 @@
                 <w:sz w:val="20"/>
                 <w:szCs w:val="20"/>
               </w:rPr>
-              <w:t xml:space="preserve">Developed Nautel AUI Monitor, a real-time transmitter health dashboard with custom telemetry alerts, enabling 24/7 unattended monitoring and reducing equipment downtime.</w:t>
+              <w:t xml:space="preserve">Engineered the Bombo Radyo News Intelligence Hub, a full-stack platform aggregating 50+ live feeds and pushing breaking news alerts directly to Discord using webhooks.</w:t>
             </w:r>
           </w:p>
           <w:p>
@@ -327,7 +327,26 @@
                 <w:sz w:val="20"/>
                 <w:szCs w:val="20"/>
               </w:rPr>
-              <w:t xml:space="preserve">Designed Weather Overlay, a vector-based weather visualization engine with real-time REST API integration, deployed across live broadcast streams reaching 100K+ viewers.</w:t>
+              <w:t xml:space="preserve">Developed Nautel AUI Monitor, a real-time transmitter health dashboard with custom telemetry alerts, enabling 24/7 unattended monitoring and reducing equipment downtime.</w:t>
+            </w:r>
+          </w:p>
+          <w:p>
+            <w:pPr>
+              <w:pStyle w:val="ListParagraph"/>
+              <w:numPr>
+                <w:ilvl w:val="0"/>
+                <w:numId w:val="1"/>
+              </w:numPr>
+              <w:spacing w:after="40"/>
+            </w:pPr>
+            <w:r>
+              <w:rPr>
+                <w:rFonts w:ascii="Calibri" w:cs="Calibri" w:eastAsia="Calibri" w:hAnsi="Calibri"/>
+                <w:color w:val="222222"/>
+                <w:sz w:val="20"/>
+                <w:szCs w:val="20"/>
+              </w:rPr>
+              <w:t xml:space="preserve">Developed Media Rename Automation, a PowerShell utility for batch-renaming video files using strict regex pattern matching, saving hours of manual data entry.</w:t>
             </w:r>
           </w:p>
           <w:p>

</xml_diff>

<commit_message>
Update OJT experience in resume and add missing project images
</commit_message>
<xml_diff>
--- a/public/Klyde_Joseph_Yabo_Resume.docx
+++ b/public/Klyde_Joseph_Yabo_Resume.docx
@@ -34,7 +34,7 @@
         </w:rPr>
         <w:t xml:space="preserve">klydejosephy@gmail.com   |   +63 945 592 7782   |   </w:t>
       </w:r>
-      <w:hyperlink w:history="1" r:id="rIdnbszuychpaseapvdx1_r7">
+      <w:hyperlink w:history="1" r:id="rIdopxnw-cxkusp93gn3tbkl">
         <w:r>
           <w:rPr>
             <w:rFonts w:ascii="Calibri" w:cs="Calibri" w:eastAsia="Calibri" w:hAnsi="Calibri"/>
@@ -55,7 +55,7 @@
         </w:rPr>
         <w:t xml:space="preserve">   |   </w:t>
       </w:r>
-      <w:hyperlink w:history="1" r:id="rIdzhjfbljjtiell_fu6r-rz">
+      <w:hyperlink w:history="1" r:id="rIdcv32chsxm4zsyeipkp4jo">
         <w:r>
           <w:rPr>
             <w:rFonts w:ascii="Calibri" w:cs="Calibri" w:eastAsia="Calibri" w:hAnsi="Calibri"/>
@@ -218,6 +218,71 @@
                 <w:sz w:val="22"/>
                 <w:szCs w:val="22"/>
               </w:rPr>
+              <w:t xml:space="preserve">IT Intern – Cash Unit (OJT)</w:t>
+            </w:r>
+            <w:r>
+              <w:rPr>
+                <w:rFonts w:ascii="Calibri" w:cs="Calibri" w:eastAsia="Calibri" w:hAnsi="Calibri"/>
+                <w:i/>
+                <w:iCs/>
+                <w:color w:val="555555"/>
+                <w:sz w:val="20"/>
+                <w:szCs w:val="20"/>
+              </w:rPr>
+              <w:t xml:space="preserve">	</w:t>
+            </w:r>
+          </w:p>
+          <w:p>
+            <w:pPr>
+              <w:spacing w:after="20"/>
+            </w:pPr>
+            <w:r>
+              <w:rPr>
+                <w:rFonts w:ascii="Calibri" w:cs="Calibri" w:eastAsia="Calibri" w:hAnsi="Calibri"/>
+                <w:i/>
+                <w:iCs/>
+                <w:color w:val="8B4513"/>
+                <w:sz w:val="20"/>
+                <w:szCs w:val="20"/>
+              </w:rPr>
+              <w:t xml:space="preserve">Department of Education, Malaybalay City</w:t>
+            </w:r>
+          </w:p>
+          <w:p>
+            <w:pPr>
+              <w:pStyle w:val="ListParagraph"/>
+              <w:numPr>
+                <w:ilvl w:val="0"/>
+                <w:numId w:val="1"/>
+              </w:numPr>
+              <w:spacing w:after="40"/>
+            </w:pPr>
+            <w:r>
+              <w:rPr>
+                <w:rFonts w:ascii="Calibri" w:cs="Calibri" w:eastAsia="Calibri" w:hAnsi="Calibri"/>
+                <w:color w:val="222222"/>
+                <w:sz w:val="20"/>
+                <w:szCs w:val="20"/>
+              </w:rPr>
+              <w:t xml:space="preserve">Assisted in computer troubleshooting, data encoding, and loan and voucher processing.</w:t>
+            </w:r>
+          </w:p>
+          <w:p>
+            <w:pPr>
+              <w:tabs>
+                <w:tab w:val="right" w:pos="9026"/>
+              </w:tabs>
+              <w:spacing w:after="20" w:before="120"/>
+            </w:pPr>
+            <w:r>
+              <w:rPr>
+                <w:rFonts w:ascii="Calibri" w:cs="Calibri" w:eastAsia="Calibri" w:hAnsi="Calibri"/>
+                <w:b/>
+                <w:bCs/>
+                <w:color w:val="222222"/>
+                <w:sz w:val="22"/>
+                <w:szCs w:val="22"/>
+              </w:rPr>
               <w:t xml:space="preserve">IT/Technician</w:t>
             </w:r>
             <w:r>

</xml_diff>

<commit_message>
Update downloadable resume with new skills
</commit_message>
<xml_diff>
--- a/public/Klyde_Joseph_Yabo_Resume.docx
+++ b/public/Klyde_Joseph_Yabo_Resume.docx
@@ -34,7 +34,7 @@
         </w:rPr>
         <w:t xml:space="preserve">klydejosephy@gmail.com   |   +63 945 592 7782   |   </w:t>
       </w:r>
-      <w:hyperlink w:history="1" r:id="rIdopxnw-cxkusp93gn3tbkl">
+      <w:hyperlink w:history="1" r:id="rIdcfj54htug0snvo_xggknt">
         <w:r>
           <w:rPr>
             <w:rFonts w:ascii="Calibri" w:cs="Calibri" w:eastAsia="Calibri" w:hAnsi="Calibri"/>
@@ -55,7 +55,7 @@
         </w:rPr>
         <w:t xml:space="preserve">   |   </w:t>
       </w:r>
-      <w:hyperlink w:history="1" r:id="rIdcv32chsxm4zsyeipkp4jo">
+      <w:hyperlink w:history="1" r:id="rIdx46jgxpucjk7veatfvd8f">
         <w:r>
           <w:rPr>
             <w:rFonts w:ascii="Calibri" w:cs="Calibri" w:eastAsia="Calibri" w:hAnsi="Calibri"/>
@@ -639,7 +639,7 @@
                 <w:sz w:val="19"/>
                 <w:szCs w:val="19"/>
               </w:rPr>
-              <w:t xml:space="preserve">Programming</w:t>
+              <w:t xml:space="preserve">Frontend</w:t>
             </w:r>
           </w:p>
           <w:p>
@@ -653,7 +653,7 @@
                 <w:sz w:val="19"/>
                 <w:szCs w:val="19"/>
               </w:rPr>
-              <w:t xml:space="preserve">Python  •  JavaScript  •  JSON  •  REST API</w:t>
+              <w:t xml:space="preserve">React  •  JavaScript  •  HTML5  •  CSS3  •  Vite  •  Responsive Design</w:t>
             </w:r>
           </w:p>
           <w:p>
@@ -669,7 +669,7 @@
                 <w:sz w:val="19"/>
                 <w:szCs w:val="19"/>
               </w:rPr>
-              <w:t xml:space="preserve">Frontend</w:t>
+              <w:t xml:space="preserve">Backend &amp; Automation</w:t>
             </w:r>
           </w:p>
           <w:p>
@@ -683,7 +683,7 @@
                 <w:sz w:val="19"/>
                 <w:szCs w:val="19"/>
               </w:rPr>
-              <w:t xml:space="preserve">React  •  HTML  •  CSS  •  Vite  •  Tailwind CSS</w:t>
+              <w:t xml:space="preserve">Python  •  Node.js  •  Playwright  •  OSC Protocol  •  WebSockets  •  API Design</w:t>
             </w:r>
           </w:p>
           <w:p>
@@ -699,7 +699,7 @@
                 <w:sz w:val="19"/>
                 <w:szCs w:val="19"/>
               </w:rPr>
-              <w:t xml:space="preserve">Automation &amp; Testing</w:t>
+              <w:t xml:space="preserve">Database &amp; Cloud</w:t>
             </w:r>
           </w:p>
           <w:p>
@@ -713,7 +713,7 @@
                 <w:sz w:val="19"/>
                 <w:szCs w:val="19"/>
               </w:rPr>
-              <w:t xml:space="preserve">Playwright  •  WebSockets  •  OSC Protocol  •  Unit Testing  •  API Integration</w:t>
+              <w:t xml:space="preserve">Supabase  •  PostgreSQL  •  REST APIs  •  Firebase App Hosting  •  Git/GitHub</w:t>
             </w:r>
           </w:p>
           <w:p>
@@ -729,7 +729,7 @@
                 <w:sz w:val="19"/>
                 <w:szCs w:val="19"/>
               </w:rPr>
-              <w:t xml:space="preserve">Tools &amp; Platforms</w:t>
+              <w:t xml:space="preserve">Broadcast Systems &amp; Tools</w:t>
             </w:r>
           </w:p>
           <w:p>
@@ -743,37 +743,7 @@
                 <w:sz w:val="19"/>
                 <w:szCs w:val="19"/>
               </w:rPr>
-              <w:t xml:space="preserve">Git  •  GitHub  •  VS Code  •  OBS Studio</w:t>
-            </w:r>
-          </w:p>
-          <w:p>
-            <w:pPr>
-              <w:spacing w:after="20" w:before="100"/>
-            </w:pPr>
-            <w:r>
-              <w:rPr>
-                <w:rFonts w:ascii="Calibri" w:cs="Calibri" w:eastAsia="Calibri" w:hAnsi="Calibri"/>
-                <w:b/>
-                <w:bCs/>
-                <w:color w:val="222222"/>
-                <w:sz w:val="19"/>
-                <w:szCs w:val="19"/>
-              </w:rPr>
-              <w:t xml:space="preserve">IT &amp; Infrastructure</w:t>
-            </w:r>
-          </w:p>
-          <w:p>
-            <w:pPr>
-              <w:spacing w:after="20"/>
-            </w:pPr>
-            <w:r>
-              <w:rPr>
-                <w:rFonts w:ascii="Calibri" w:cs="Calibri" w:eastAsia="Calibri" w:hAnsi="Calibri"/>
-                <w:color w:val="555555"/>
-                <w:sz w:val="19"/>
-                <w:szCs w:val="19"/>
-              </w:rPr>
-              <w:t xml:space="preserve">IT Support  •  Network Configuration  •  Hardware Troubleshooting  •  Technical Documentation</w:t>
+              <w:t xml:space="preserve">OBS Studio  •  Nautel Telemetry  •  X32 Control  •  Linux Systems  •  Video Editing</w:t>
             </w:r>
           </w:p>
           <w:p>

</xml_diff>